<commit_message>
Update lecture materials and add transcription script and outputs
- Update lecture sources, rendered PDFs, figures, and review records.
- Add the lecture transcription script and Markdown, SRT, and text outputs.
- Update the course-link document.
- Keep the recording and audio files locally and ignore them in Git.
</commit_message>
<xml_diff>
--- a/講義リンク（マクロ経済学B）.docx
+++ b/講義リンク（マクロ経済学B）.docx
@@ -114,6 +114,69 @@
       </w:r>
       <w:r>
         <w:t>: n9F.DT?U</w:t>
+      </w:r>
+    </w:p>
+    <w:p/>
+    <w:p>
+      <w:r>
+        <w:rPr>
+          <w:rFonts w:hint="eastAsia"/>
+        </w:rPr>
+        <w:t>第</w:t>
+      </w:r>
+      <w:r>
+        <w:t>2</w:t>
+      </w:r>
+      <w:r>
+        <w:rPr>
+          <w:rFonts w:hint="eastAsia"/>
+        </w:rPr>
+        <w:t>回リンク（0</w:t>
+      </w:r>
+      <w:r>
+        <w:t>92</w:t>
+      </w:r>
+      <w:r>
+        <w:t>9</w:t>
+      </w:r>
+      <w:r>
+        <w:rPr>
+          <w:rFonts w:hint="eastAsia"/>
+        </w:rPr>
+        <w:t>）</w:t>
+      </w:r>
+    </w:p>
+    <w:p>
+      <w:hyperlink r:id="rId6" w:history="1">
+        <w:r>
+          <w:rPr>
+            <w:rStyle w:val="aa"/>
+          </w:rPr>
+          <w:t>https:/</w:t>
+        </w:r>
+        <w:r>
+          <w:rPr>
+            <w:rStyle w:val="aa"/>
+          </w:rPr>
+          <w:t>/</w:t>
+        </w:r>
+        <w:r>
+          <w:rPr>
+            <w:rStyle w:val="aa"/>
+          </w:rPr>
+          <w:t>hosei-ac-jp.zoom.us/rec/share/cEO_Y98y3vEufZ2cw53xozNRSjloWZel7Ru8QRvKVuBSfQb2VPskKv8DSVZBf1I.Cd5Lwqh3OoUmsAJt</w:t>
+        </w:r>
+      </w:hyperlink>
+    </w:p>
+    <w:p>
+      <w:r>
+        <w:rPr>
+          <w:rFonts w:hint="eastAsia"/>
+        </w:rPr>
+        <w:t>パスコード</w:t>
+      </w:r>
+      <w:r>
+        <w:t>: k#0k%Lv^</w:t>
       </w:r>
     </w:p>
     <w:sectPr>

</xml_diff>

<commit_message>
Add updated lecture links document and related files
- Created a new Word document with updated lecture links.
- Added necessary XML files for document structure and styles.
- Included font table and settings for proper document formatting.
</commit_message>
<xml_diff>
--- a/講義リンク（マクロ経済学B）.docx
+++ b/講義リンク（マクロ経済学B）.docx
@@ -134,10 +134,7 @@
         <w:t>回リンク（0</w:t>
       </w:r>
       <w:r>
-        <w:t>92</w:t>
-      </w:r>
-      <w:r>
-        <w:t>9</w:t>
+        <w:t>929</w:t>
       </w:r>
       <w:r>
         <w:rPr>
@@ -152,19 +149,85 @@
           <w:rPr>
             <w:rStyle w:val="aa"/>
           </w:rPr>
-          <w:t>https:/</w:t>
+          <w:t>https://hosei-ac-jp.zoom.us/rec/share/cEO_Y98y3vEufZ2cw53xozNRSjloWZel7Ru8QRvKVuBSfQb2VPskKv8DSVZBf1I.Cd5Lwqh3OoUmsAJt</w:t>
         </w:r>
+      </w:hyperlink>
+    </w:p>
+    <w:p>
+      <w:r>
+        <w:rPr>
+          <w:rFonts w:hint="eastAsia"/>
+        </w:rPr>
+        <w:t>パスコード</w:t>
+      </w:r>
+      <w:r>
+        <w:t>: k#0k%Lv^</w:t>
+      </w:r>
+    </w:p>
+    <w:p/>
+    <w:p>
+      <w:r>
+        <w:rPr>
+          <w:rFonts w:hint="eastAsia"/>
+        </w:rPr>
+        <w:t>第3回リンク（1006）</w:t>
+      </w:r>
+    </w:p>
+    <w:p>
+      <w:hyperlink r:id="rId7" w:history="1">
         <w:r>
           <w:rPr>
             <w:rStyle w:val="aa"/>
           </w:rPr>
-          <w:t>/</w:t>
+          <w:t>https://hosei-ac-jp.zoom.us/rec/share/mHqZzeTiLdSbJd9goQe3x-5uZiO33w_AWFc6x8Yi5WAAEJNalxUDO-9Z7bEQx2cB.dJBUVtdAeDR4wdYy</w:t>
         </w:r>
+      </w:hyperlink>
+    </w:p>
+    <w:p>
+      <w:r>
+        <w:rPr>
+          <w:rFonts w:hint="eastAsia"/>
+        </w:rPr>
+        <w:t>パスコード</w:t>
+      </w:r>
+      <w:r>
+        <w:t>: 6q7ZWA!m</w:t>
+      </w:r>
+    </w:p>
+    <w:p/>
+    <w:p>
+      <w:r>
+        <w:rPr>
+          <w:rFonts w:hint="eastAsia"/>
+        </w:rPr>
+        <w:t>第</w:t>
+      </w:r>
+      <w:r>
+        <w:t>4</w:t>
+      </w:r>
+      <w:r>
+        <w:rPr>
+          <w:rFonts w:hint="eastAsia"/>
+        </w:rPr>
+        <w:t>回リンク（10</w:t>
+      </w:r>
+      <w:r>
+        <w:t>13</w:t>
+      </w:r>
+      <w:r>
+        <w:rPr>
+          <w:rFonts w:hint="eastAsia"/>
+        </w:rPr>
+        <w:t>）</w:t>
+      </w:r>
+    </w:p>
+    <w:p>
+      <w:hyperlink r:id="rId8" w:history="1">
         <w:r>
           <w:rPr>
             <w:rStyle w:val="aa"/>
           </w:rPr>
-          <w:t>hosei-ac-jp.zoom.us/rec/share/cEO_Y98y3vEufZ2cw53xozNRSjloWZel7Ru8QRvKVuBSfQb2VPskKv8DSVZBf1I.Cd5Lwqh3OoUmsAJt</w:t>
+          <w:t>https://hosei-ac-jp.zoom.us/rec/share/uTT2eyc5ECsKJm9-rmgaKyj9JBQETr-vr3PqizfT7NwfASfzK_olELIuvBx1HYf-.NS7QuZKFbW6SSxgd</w:t>
         </w:r>
       </w:hyperlink>
     </w:p>
@@ -176,7 +239,55 @@
         <w:t>パスコード</w:t>
       </w:r>
       <w:r>
-        <w:t>: k#0k%Lv^</w:t>
+        <w:t>: Pm+6@YW3</w:t>
+      </w:r>
+    </w:p>
+    <w:p/>
+    <w:p>
+      <w:r>
+        <w:rPr>
+          <w:rFonts w:hint="eastAsia"/>
+        </w:rPr>
+        <w:t>第</w:t>
+      </w:r>
+      <w:r>
+        <w:t>5</w:t>
+      </w:r>
+      <w:r>
+        <w:rPr>
+          <w:rFonts w:hint="eastAsia"/>
+        </w:rPr>
+        <w:t>回リンク（10</w:t>
+      </w:r>
+      <w:r>
+        <w:t>20</w:t>
+      </w:r>
+      <w:r>
+        <w:rPr>
+          <w:rFonts w:hint="eastAsia"/>
+        </w:rPr>
+        <w:t>）</w:t>
+      </w:r>
+    </w:p>
+    <w:p>
+      <w:hyperlink r:id="rId9" w:history="1">
+        <w:r>
+          <w:rPr>
+            <w:rStyle w:val="aa"/>
+          </w:rPr>
+          <w:t>https://hosei-ac-jp.zoom.us/rec/share/tZqYdUn0oHtDX_hE0TfqPtkrqn7SnGe9ZKrdm41a5xh7sLh8lFVZCTeQ0F65ymzp.RmAqMkVMw0-djOcj</w:t>
+        </w:r>
+      </w:hyperlink>
+    </w:p>
+    <w:p>
+      <w:r>
+        <w:rPr>
+          <w:rFonts w:hint="eastAsia"/>
+        </w:rPr>
+        <w:t>パスコード</w:t>
+      </w:r>
+      <w:r>
+        <w:t>: %1@y+4Ff</w:t>
       </w:r>
     </w:p>
     <w:sectPr>

</xml_diff>